<commit_message>
Add TBT, prequalification and drill reporting to HSES resume
Co-Authored-By: Claude Opus 5.5 <noreply@anthropic.com>
Claude-Session: https://claude.ai/code/session_01QFX3qArYXe5Kfzw5367xEF
</commit_message>
<xml_diff>
--- a/HSES_Advisor_Oil_Gas_Resume.docx
+++ b/HSES_Advisor_Oil_Gas_Resume.docx
@@ -94,7 +94,7 @@
           <w:sz w:val="20"/>
           <w:szCs w:val="20"/>
         </w:rPr>
-        <w:t xml:space="preserve">HSES professional with 25 years of experience, including 15+ years in Oil &amp; Gas HSES across gas processing, upstream, pipeline, terminal, refinery and petrochemical projects and operations in Turkmenistan, Oman, Kazakhstan, the UAE and Qatar. Holds a Diploma in Fire Engineering &amp; Safety Management, a Diploma in Industrial Safety and NEBOSH IGC. Experienced in developing and implementing HSES plans, procedures and instructions, and in giving HSES guidance to frontline supervision and field personnel. Mentors and coaches junior HSES staff. Monitors subcontractor compliance with safe work practices, takes part in risk assessments and maintains risk registers, and controls Permit to Work (PTW) compliance through inspections. Plans and conducts HSES audits and inspections and tracks findings to close-out (98% closure rate). Leads emergency response drills and incident investigations. Conversant with local and international HSES laws, codes and standards (ISO 45001, ISO 14001, Chevron OEMS, PDO and CPC requirements). Strong communication, presentation, interpersonal, conflict-resolution and leadership skills, built leading multinational workforces of 5,000+.</w:t>
+        <w:t xml:space="preserve">HSES professional with 25 years of experience, including 15+ years in Oil &amp; Gas HSES across gas processing, upstream, pipeline, terminal, refinery and petrochemical projects and operations in Turkmenistan, Oman, Kazakhstan, the UAE and Qatar. Holds a Diploma in Fire Engineering &amp; Safety Management, a Diploma in Industrial Safety and NEBOSH IGC. Experienced in developing and implementing HSES plans, procedures and instructions, and in giving HSES guidance to frontline supervision and field personnel. Mentors and coaches junior HSES staff. Takes part in HSES prequalification of subcontractors and vendors and monitors their compliance with safe work practices. Develops Toolbox Talk (TBT) plans and material, takes part in risk assessments and maintains risk registers, and controls Permit to Work (PTW) compliance through inspections. Plans and conducts HSES audits and inspections and tracks findings to close-out (98% closure rate). Leads emergency response drills (including drill reports and emergency equipment inspection) and incident investigations. Conversant with local and international HSES laws, codes and standards (ISO 45001, ISO 14001, Chevron OEMS, PDO and CPC requirements). Strong communication, presentation, interpersonal, conflict-resolution and leadership skills, built leading multinational workforces of 5,000+.</w:t>
       </w:r>
     </w:p>
     <w:p>
@@ -128,7 +128,7 @@
           <w:sz w:val="20"/>
           <w:szCs w:val="20"/>
         </w:rPr>
-        <w:t xml:space="preserve">HSES Plans, Procedures &amp; Instructions | HSES Guidance to Frontline Supervision | Mentoring &amp; Coaching of HSES Staff | Subcontractor &amp; Vendor HSES Compliance Monitoring | Contractor HSES Management System Review | Risk Assessment | Risk Register Management | HSES Activity Plan Execution | Permit to Work (PTW) Planning, Inspection &amp; Compliance | HSES Audits &amp; Inspections | Audit &amp; Inspection Findings Tracking &amp; Reporting | HSES Initiatives &amp; Behaviour-Based Safety | Emergency Response Drills &amp; Reporting | Incident Investigation &amp; Reporting (ICAM / RCA) | HSES Training &amp; Competence | JSA | HAZID | HAZOP | LOPA | Bow-Tie | PSSR | MOC | Confined Space | LOTO | Hot Work | Working at Height | Critical Lifting | ISO 45001 | ISO 14001 | Local &amp; International HSES Laws, Codes &amp; Regulations | HSES KPI Reporting</w:t>
+        <w:t xml:space="preserve">HSES Plans, Procedures &amp; Instructions | HSES Guidance to Frontline Supervision | Mentoring &amp; Coaching of HSES Staff | Subcontractor &amp; Vendor HSES Prequalification | Subcontractor &amp; Vendor HSES Compliance Monitoring | Toolbox Talk (TBT) Planning &amp; Delivery | Contractor HSES Management System Review | Risk Assessment | Risk Register Management | HSES Activity Plan Execution | Permit to Work (PTW) Planning, Inspection &amp; Compliance | HSES Audits &amp; Inspections | Audit &amp; Inspection Findings Tracking &amp; Reporting | HSES Initiatives &amp; Behaviour-Based Safety | Emergency Response Drills, Reports &amp; Equipment Inspection | Incident Investigation &amp; Reporting (ICAM / RCA) | HSES Training &amp; Competence | JSA | HAZID | HAZOP | LOPA | Bow-Tie | PSSR | MOC | Confined Space | LOTO | Hot Work | Working at Height | Critical Lifting | ISO 45001 | ISO 14001 | Local &amp; International HSES Laws, Codes &amp; Regulations | HSES KPI Reporting</w:t>
       </w:r>
     </w:p>
     <w:p>
@@ -610,7 +610,25 @@
           <w:sz w:val="20"/>
           <w:szCs w:val="20"/>
         </w:rPr>
-        <w:t xml:space="preserve">Monitor subcontractor compliance with safe work practices by reviewing subcontractor HSES management systems, procedures and work packages before execution.</w:t>
+        <w:t xml:space="preserve">Take part in HSES prequalification of subcontractors and vendors. Monitor subcontractor compliance with safe work practices by reviewing subcontractor HSES management systems, procedures and work packages before execution.</w:t>
+      </w:r>
+    </w:p>
+    <w:p>
+      <w:pPr>
+        <w:pStyle w:val="ListParagraph"/>
+        <w:numPr>
+          <w:ilvl w:val="0"/>
+          <w:numId w:val="2"/>
+        </w:numPr>
+        <w:spacing w:after="40"/>
+      </w:pPr>
+      <w:r>
+        <w:rPr>
+          <w:rFonts w:ascii="Calibri" w:cs="Calibri" w:eastAsia="Calibri" w:hAnsi="Calibri"/>
+          <w:sz w:val="20"/>
+          <w:szCs w:val="20"/>
+        </w:rPr>
+        <w:t xml:space="preserve">Developed the Toolbox Talk (TBT) plan and supporting material, and observed and assisted supervisors delivering TBTs.</w:t>
       </w:r>
     </w:p>
     <w:p>
@@ -762,7 +780,7 @@
           <w:sz w:val="20"/>
           <w:szCs w:val="20"/>
         </w:rPr>
-        <w:t xml:space="preserve">Established emergency response capability and executed quarterly full-scale emergency response drills.</w:t>
+        <w:t xml:space="preserve">Established emergency response capability and executed quarterly full-scale emergency response drills, preparing drill reports and inspecting emergency response equipment.</w:t>
       </w:r>
     </w:p>
     <w:p>
@@ -1908,7 +1926,7 @@
           <w:sz w:val="20"/>
           <w:szCs w:val="20"/>
         </w:rPr>
-        <w:t xml:space="preserve"> emergency response drills, incident investigation and reporting (ICAM / RCA), H2S and SCBA, industrial fire fighting, disaster management</w:t>
+        <w:t xml:space="preserve"> emergency response drills, drill reports and emergency equipment inspection, incident investigation and reporting (ICAM / RCA), H2S and SCBA, industrial fire fighting, disaster management</w:t>
       </w:r>
     </w:p>
     <w:p>

</xml_diff>